<commit_message>
Add final PPT export and sync final deliverable files
</commit_message>
<xml_diff>
--- a/deliverables/SRAM_AI_Adoption_Playbook_Final.docx
+++ b/deliverables/SRAM_AI_Adoption_Playbook_Final.docx
@@ -13,14 +13,34 @@
         </w:rPr>
       </w:pPr>
       <w:bookmarkStart w:id="0" w:name="sram-llc---ai-adoption-playbook"/>
-      <w:r>
-        <w:rPr>
-          <w:rFonts w:ascii="Times New Roman" w:hAnsi="Times New Roman" w:cs="Times New Roman"/>
-          <w:color w:val="000000" w:themeColor="text1"/>
-          <w:sz w:val="20"/>
-          <w:szCs w:val="20"/>
-        </w:rPr>
-        <w:t>SRAM LLC - AI Adoption Playbook</w:t>
+      <w:proofErr w:type="spellStart"/>
+      <w:r>
+        <w:rPr>
+          <w:rFonts w:ascii="Times New Roman" w:hAnsi="Times New Roman" w:cs="Times New Roman"/>
+          <w:color w:val="000000" w:themeColor="text1"/>
+          <w:sz w:val="20"/>
+          <w:szCs w:val="20"/>
+        </w:rPr>
+        <w:t>PLe</w:t>
+      </w:r>
+      <w:r>
+        <w:rPr>
+          <w:rFonts w:ascii="Times New Roman" w:hAnsi="Times New Roman" w:cs="Times New Roman"/>
+          <w:color w:val="000000" w:themeColor="text1"/>
+          <w:sz w:val="20"/>
+          <w:szCs w:val="20"/>
+        </w:rPr>
+        <w:t>SRAM</w:t>
+      </w:r>
+      <w:proofErr w:type="spellEnd"/>
+      <w:r>
+        <w:rPr>
+          <w:rFonts w:ascii="Times New Roman" w:hAnsi="Times New Roman" w:cs="Times New Roman"/>
+          <w:color w:val="000000" w:themeColor="text1"/>
+          <w:sz w:val="20"/>
+          <w:szCs w:val="20"/>
+        </w:rPr>
+        <w:t xml:space="preserve"> LLC - AI Adoption Playbook</w:t>
       </w:r>
     </w:p>
     <w:p>
@@ -4347,7 +4367,7 @@
                 <w:sz w:val="20"/>
                 <w:szCs w:val="20"/>
               </w:rPr>
-              <w:t>Month 0-6: ERP and CRM implementation vendor contracting; AWS data lakehouse architecture finalized</w:t>
+              <w:t>Month 0-6: ERP and CRM vendor contracting; AWS data lakehouse architecture finalized</w:t>
             </w:r>
           </w:p>
           <w:p>
@@ -4373,7 +4393,7 @@
                 <w:sz w:val="20"/>
                 <w:szCs w:val="20"/>
               </w:rPr>
-              <w:t>Month 6-18: SAP implement and go-</w:t>
+              <w:t>Month 6-18: SAP go-</w:t>
             </w:r>
             <w:r>
               <w:rPr>
@@ -4417,7 +4437,45 @@
                 <w:sz w:val="20"/>
                 <w:szCs w:val="20"/>
               </w:rPr>
-              <w:t xml:space="preserve">Month 12-24: AXS, Hammerhead, Quarq, and other telemetry data integrated into data lakehouse; </w:t>
+              <w:t xml:space="preserve">Month 12-24: </w:t>
+            </w:r>
+            <w:r>
+              <w:rPr>
+                <w:rFonts w:ascii="Times New Roman" w:hAnsi="Times New Roman" w:cs="Times New Roman"/>
+                <w:color w:val="000000" w:themeColor="text1"/>
+                <w:sz w:val="20"/>
+                <w:szCs w:val="20"/>
+              </w:rPr>
+              <w:t xml:space="preserve">Product </w:t>
+            </w:r>
+            <w:r>
+              <w:rPr>
+                <w:rFonts w:ascii="Times New Roman" w:hAnsi="Times New Roman" w:cs="Times New Roman"/>
+                <w:color w:val="000000" w:themeColor="text1"/>
+                <w:sz w:val="20"/>
+                <w:szCs w:val="20"/>
+              </w:rPr>
+              <w:t xml:space="preserve">telemetry data integrated into data </w:t>
+            </w:r>
+            <w:proofErr w:type="spellStart"/>
+            <w:r>
+              <w:rPr>
+                <w:rFonts w:ascii="Times New Roman" w:hAnsi="Times New Roman" w:cs="Times New Roman"/>
+                <w:color w:val="000000" w:themeColor="text1"/>
+                <w:sz w:val="20"/>
+                <w:szCs w:val="20"/>
+              </w:rPr>
+              <w:t>lakehouse</w:t>
+            </w:r>
+            <w:proofErr w:type="spellEnd"/>
+            <w:r>
+              <w:rPr>
+                <w:rFonts w:ascii="Times New Roman" w:hAnsi="Times New Roman" w:cs="Times New Roman"/>
+                <w:color w:val="000000" w:themeColor="text1"/>
+                <w:sz w:val="20"/>
+                <w:szCs w:val="20"/>
+              </w:rPr>
+              <w:t xml:space="preserve">; </w:t>
             </w:r>
             <w:r>
               <w:rPr>
@@ -4650,17 +4708,7 @@
                 <w:sz w:val="20"/>
                 <w:szCs w:val="20"/>
               </w:rPr>
-              <w:t xml:space="preserve">Data engineering team tasked with data lakehouse architecture, construction, and data taxonomy to </w:t>
-            </w:r>
-            <w:r>
-              <w:rPr>
-                <w:rFonts w:ascii="Times New Roman" w:hAnsi="Times New Roman" w:cs="Times New Roman"/>
-                <w:color w:val="000000" w:themeColor="text1"/>
-                <w:sz w:val="20"/>
-                <w:szCs w:val="20"/>
-              </w:rPr>
-              <w:lastRenderedPageBreak/>
-              <w:t>ingest and compile disparate data into usable format</w:t>
+              <w:t>Data engineering team tasked with data lakehouse architecture, construction, and data taxonomy to ingest and compile disparate data into usable format</w:t>
             </w:r>
           </w:p>
         </w:tc>
@@ -5513,6 +5561,7 @@
           <w:sz w:val="20"/>
           <w:szCs w:val="20"/>
         </w:rPr>
+        <w:lastRenderedPageBreak/>
         <w:t xml:space="preserve">Actionable Pilots – </w:t>
       </w:r>
       <w:r>
@@ -6525,7 +6574,7 @@
                 <w:sz w:val="20"/>
                 <w:szCs w:val="20"/>
               </w:rPr>
-              <w:t xml:space="preserve">reduction in average </w:t>
+              <w:t xml:space="preserve">reduction in average time to first response on AXS and Hammerhead </w:t>
             </w:r>
             <w:r>
               <w:rPr>
@@ -6535,7 +6584,7 @@
                 <w:szCs w:val="20"/>
               </w:rPr>
               <w:lastRenderedPageBreak/>
-              <w:t>time to first response on AXS and Hammerhead ticket pilots</w:t>
+              <w:t>ticket pilots</w:t>
             </w:r>
           </w:p>
           <w:p>
@@ -6697,7 +6746,6 @@
                 <w:sz w:val="20"/>
                 <w:szCs w:val="20"/>
               </w:rPr>
-              <w:lastRenderedPageBreak/>
               <w:t>By Month 36:</w:t>
             </w:r>
           </w:p>
@@ -6724,7 +6772,17 @@
                 <w:sz w:val="20"/>
                 <w:szCs w:val="20"/>
               </w:rPr>
-              <w:t>30% reduction in stockout rate</w:t>
+              <w:t xml:space="preserve">30% reduction in stockout </w:t>
+            </w:r>
+            <w:r>
+              <w:rPr>
+                <w:rFonts w:ascii="Times New Roman" w:hAnsi="Times New Roman" w:cs="Times New Roman"/>
+                <w:color w:val="000000" w:themeColor="text1"/>
+                <w:sz w:val="20"/>
+                <w:szCs w:val="20"/>
+              </w:rPr>
+              <w:lastRenderedPageBreak/>
+              <w:t>rate</w:t>
             </w:r>
           </w:p>
           <w:p>
@@ -7725,7 +7783,16 @@
           <w:sz w:val="20"/>
           <w:szCs w:val="20"/>
         </w:rPr>
-        <w:t xml:space="preserve"> for these initiatives on that basis; depending on where SRAM is on its AI journey initially 36 months in and where their business is positioned, these opportunities may be ranked differently depending on strategic importance and potential returns. As such, we </w:t>
+        <w:t xml:space="preserve"> for these initiatives on that basis; depending on where SRAM is on its AI journey initially 36 months in and where their business is positioned, these opportunities may be ranked differently depending on strategic importance and potential returns. As such, we view these </w:t>
+      </w:r>
+      <w:r>
+        <w:rPr>
+          <w:rFonts w:ascii="Times New Roman" w:hAnsi="Times New Roman" w:cs="Times New Roman"/>
+          <w:color w:val="000000" w:themeColor="text1"/>
+          <w:sz w:val="20"/>
+          <w:szCs w:val="20"/>
+        </w:rPr>
+        <w:t xml:space="preserve">AI applications as more of what SRAM could look like as an AI-first company by the end of our horizon but have offered specific guidance on how they might enact these strategies below. As stated previously, it’s </w:t>
       </w:r>
       <w:r>
         <w:rPr>
@@ -7735,16 +7802,7 @@
           <w:szCs w:val="20"/>
         </w:rPr>
         <w:lastRenderedPageBreak/>
-        <w:t xml:space="preserve">view these </w:t>
-      </w:r>
-      <w:r>
-        <w:rPr>
-          <w:rFonts w:ascii="Times New Roman" w:hAnsi="Times New Roman" w:cs="Times New Roman"/>
-          <w:color w:val="000000" w:themeColor="text1"/>
-          <w:sz w:val="20"/>
-          <w:szCs w:val="20"/>
-        </w:rPr>
-        <w:t>AI applications as more of what SRAM could look like as an AI-first company by the end of our horizon but have offered specific guidance on how they might enact these strategies below. As stated previously, it’s SRAMs unique market position today that lends itself to being able to extract outsized returns from developing a coherent, targeted, and ambitious AI strategy. This is what the fruit of that labor could look like.</w:t>
+        <w:t>SRAMs unique market position today that lends itself to being able to extract outsized returns from developing a coherent, targeted, and ambitious AI strategy. This is what the fruit of that labor could look like.</w:t>
       </w:r>
     </w:p>
     <w:tbl>
@@ -9041,7 +9099,16 @@
                 <w:sz w:val="20"/>
                 <w:szCs w:val="20"/>
               </w:rPr>
-              <w:t>AI deal intelligence to improve OEM win rates</w:t>
+              <w:t xml:space="preserve">AI deal intelligence to improve OEM </w:t>
+            </w:r>
+            <w:r>
+              <w:rPr>
+                <w:rFonts w:ascii="Times New Roman" w:hAnsi="Times New Roman" w:cs="Times New Roman"/>
+                <w:color w:val="000000" w:themeColor="text1"/>
+                <w:sz w:val="20"/>
+                <w:szCs w:val="20"/>
+              </w:rPr>
+              <w:t>closes</w:t>
             </w:r>
           </w:p>
         </w:tc>
@@ -9330,17 +9397,7 @@
                 <w:sz w:val="20"/>
                 <w:szCs w:val="20"/>
               </w:rPr>
-              <w:t xml:space="preserve">Compatible </w:t>
-            </w:r>
-            <w:r>
-              <w:rPr>
-                <w:rFonts w:ascii="Times New Roman" w:hAnsi="Times New Roman" w:cs="Times New Roman"/>
-                <w:color w:val="000000" w:themeColor="text1"/>
-                <w:sz w:val="20"/>
-                <w:szCs w:val="20"/>
-              </w:rPr>
-              <w:lastRenderedPageBreak/>
-              <w:t>upgrade recommendations</w:t>
+              <w:t>Compatible upgrade recommendations</w:t>
             </w:r>
           </w:p>
         </w:tc>
@@ -9367,18 +9424,7 @@
                 <w:sz w:val="20"/>
                 <w:szCs w:val="20"/>
               </w:rPr>
-              <w:lastRenderedPageBreak/>
-              <w:t xml:space="preserve">Amazon SageMaker compatibility rules </w:t>
-            </w:r>
-            <w:r>
-              <w:rPr>
-                <w:rFonts w:ascii="Times New Roman" w:hAnsi="Times New Roman" w:cs="Times New Roman"/>
-                <w:color w:val="000000" w:themeColor="text1"/>
-                <w:sz w:val="20"/>
-                <w:szCs w:val="20"/>
-              </w:rPr>
-              <w:lastRenderedPageBreak/>
-              <w:t>engine + recommendation model</w:t>
+              <w:t>Amazon SageMaker compatibility rules engine + recommendation model</w:t>
             </w:r>
           </w:p>
           <w:p>
@@ -9610,7 +9656,17 @@
                 <w:sz w:val="20"/>
                 <w:szCs w:val="20"/>
               </w:rPr>
-              <w:t xml:space="preserve"> cross-sell/upsell lift (3-5% of registered user base); $1</w:t>
+              <w:t xml:space="preserve"> cross-</w:t>
+            </w:r>
+            <w:r>
+              <w:rPr>
+                <w:rFonts w:ascii="Times New Roman" w:hAnsi="Times New Roman" w:cs="Times New Roman"/>
+                <w:color w:val="000000" w:themeColor="text1"/>
+                <w:sz w:val="20"/>
+                <w:szCs w:val="20"/>
+              </w:rPr>
+              <w:lastRenderedPageBreak/>
+              <w:t>sell/upsell lift (3-5% of registered user base); $1</w:t>
             </w:r>
             <w:r>
               <w:rPr>
@@ -9815,6 +9871,15 @@
     <w:p>
       <w:pPr>
         <w:pStyle w:val="BodyText"/>
+        <w:rPr>
+          <w:color w:val="000000" w:themeColor="text1"/>
+        </w:rPr>
+      </w:pPr>
+    </w:p>
+    <w:p>
+      <w:pPr>
+        <w:pStyle w:val="BodyText"/>
+        <w:jc w:val="center"/>
         <w:rPr>
           <w:color w:val="000000" w:themeColor="text1"/>
         </w:rPr>
@@ -13297,6 +13362,7 @@
   <w:style w:type="character" w:default="1" w:styleId="DefaultParagraphFont">
     <w:name w:val="Default Paragraph Font"/>
     <w:uiPriority w:val="1"/>
+    <w:semiHidden/>
     <w:unhideWhenUsed/>
   </w:style>
   <w:style w:type="table" w:default="1" w:styleId="TableNormal">

</xml_diff>